<commit_message>
added drag and drop + line balancing
</commit_message>
<xml_diff>
--- a/SIT submission/Problem statement draft.docx
+++ b/SIT submission/Problem statement draft.docx
@@ -138,10 +138,7 @@
       </w:r>
       <w:proofErr w:type="gramEnd"/>
       <w:r>
-        <w:t>, not just theoretically possible</w:t>
-      </w:r>
-      <w:r>
-        <w:t xml:space="preserve">. </w:t>
+        <w:t xml:space="preserve">, not just theoretically possible. </w:t>
       </w:r>
     </w:p>
     <w:p>
@@ -178,13 +175,7 @@
     <w:p/>
     <w:p>
       <w:r>
-        <w:t xml:space="preserve">As such, the capstone project is not to replace the table-top experience but to streamline it and pre-process the information. Its main purpose is to save time by pre-validating the standard work and keep the table-top simulation as a discussion to the feasibility of the line creation and </w:t>
-      </w:r>
-      <w:r>
-        <w:t>its</w:t>
-      </w:r>
-      <w:r>
-        <w:t xml:space="preserve"> future operation. Hence, the table-top simulation will serve as a final validation before the plan is place into motion.</w:t>
+        <w:t>As such, the capstone project is not to replace the table-top experience but to streamline it and pre-process the information. Its main purpose is to save time by pre-validating the standard work and keep the table-top simulation as a discussion to the feasibility of the line creation and its future operation. Hence, the table-top simulation will serve as a final validation before the plan is place into motion.</w:t>
       </w:r>
     </w:p>
     <w:p/>
@@ -577,6 +568,158 @@
       </w:tr>
     </w:tbl>
     <w:p/>
+    <w:p>
+      <w:r>
+        <w:lastRenderedPageBreak/>
+        <w:drawing>
+          <wp:inline distT="0" distB="0" distL="0" distR="0" wp14:anchorId="0DAD6240" wp14:editId="6EE70243">
+            <wp:extent cx="5731510" cy="2852420"/>
+            <wp:effectExtent l="0" t="0" r="2540" b="5080"/>
+            <wp:docPr id="996153469" name="Picture 1"/>
+            <wp:cNvGraphicFramePr>
+              <a:graphicFrameLocks xmlns:a="http://schemas.openxmlformats.org/drawingml/2006/main" noChangeAspect="1"/>
+            </wp:cNvGraphicFramePr>
+            <a:graphic xmlns:a="http://schemas.openxmlformats.org/drawingml/2006/main">
+              <a:graphicData uri="http://schemas.openxmlformats.org/drawingml/2006/picture">
+                <pic:pic xmlns:pic="http://schemas.openxmlformats.org/drawingml/2006/picture">
+                  <pic:nvPicPr>
+                    <pic:cNvPr id="996153469" name=""/>
+                    <pic:cNvPicPr/>
+                  </pic:nvPicPr>
+                  <pic:blipFill>
+                    <a:blip r:embed="rId5"/>
+                    <a:stretch>
+                      <a:fillRect/>
+                    </a:stretch>
+                  </pic:blipFill>
+                  <pic:spPr>
+                    <a:xfrm>
+                      <a:off x="0" y="0"/>
+                      <a:ext cx="5731510" cy="2852420"/>
+                    </a:xfrm>
+                    <a:prstGeom prst="rect">
+                      <a:avLst/>
+                    </a:prstGeom>
+                  </pic:spPr>
+                </pic:pic>
+              </a:graphicData>
+            </a:graphic>
+          </wp:inline>
+        </w:drawing>
+      </w:r>
+      <w:r>
+        <w:drawing>
+          <wp:inline distT="0" distB="0" distL="0" distR="0" wp14:anchorId="1A4A809E" wp14:editId="6155186A">
+            <wp:extent cx="5731510" cy="2372360"/>
+            <wp:effectExtent l="0" t="0" r="2540" b="8890"/>
+            <wp:docPr id="1971887108" name="Picture 1"/>
+            <wp:cNvGraphicFramePr>
+              <a:graphicFrameLocks xmlns:a="http://schemas.openxmlformats.org/drawingml/2006/main" noChangeAspect="1"/>
+            </wp:cNvGraphicFramePr>
+            <a:graphic xmlns:a="http://schemas.openxmlformats.org/drawingml/2006/main">
+              <a:graphicData uri="http://schemas.openxmlformats.org/drawingml/2006/picture">
+                <pic:pic xmlns:pic="http://schemas.openxmlformats.org/drawingml/2006/picture">
+                  <pic:nvPicPr>
+                    <pic:cNvPr id="1971887108" name=""/>
+                    <pic:cNvPicPr/>
+                  </pic:nvPicPr>
+                  <pic:blipFill>
+                    <a:blip r:embed="rId6"/>
+                    <a:stretch>
+                      <a:fillRect/>
+                    </a:stretch>
+                  </pic:blipFill>
+                  <pic:spPr>
+                    <a:xfrm>
+                      <a:off x="0" y="0"/>
+                      <a:ext cx="5731510" cy="2372360"/>
+                    </a:xfrm>
+                    <a:prstGeom prst="rect">
+                      <a:avLst/>
+                    </a:prstGeom>
+                  </pic:spPr>
+                </pic:pic>
+              </a:graphicData>
+            </a:graphic>
+          </wp:inline>
+        </w:drawing>
+      </w:r>
+      <w:r>
+        <w:lastRenderedPageBreak/>
+        <w:drawing>
+          <wp:inline distT="0" distB="0" distL="0" distR="0" wp14:anchorId="6B431F4D" wp14:editId="30E38BFA">
+            <wp:extent cx="5731510" cy="2696210"/>
+            <wp:effectExtent l="0" t="0" r="2540" b="8890"/>
+            <wp:docPr id="1006629996" name="Picture 1"/>
+            <wp:cNvGraphicFramePr>
+              <a:graphicFrameLocks xmlns:a="http://schemas.openxmlformats.org/drawingml/2006/main" noChangeAspect="1"/>
+            </wp:cNvGraphicFramePr>
+            <a:graphic xmlns:a="http://schemas.openxmlformats.org/drawingml/2006/main">
+              <a:graphicData uri="http://schemas.openxmlformats.org/drawingml/2006/picture">
+                <pic:pic xmlns:pic="http://schemas.openxmlformats.org/drawingml/2006/picture">
+                  <pic:nvPicPr>
+                    <pic:cNvPr id="1006629996" name=""/>
+                    <pic:cNvPicPr/>
+                  </pic:nvPicPr>
+                  <pic:blipFill>
+                    <a:blip r:embed="rId7"/>
+                    <a:stretch>
+                      <a:fillRect/>
+                    </a:stretch>
+                  </pic:blipFill>
+                  <pic:spPr>
+                    <a:xfrm>
+                      <a:off x="0" y="0"/>
+                      <a:ext cx="5731510" cy="2696210"/>
+                    </a:xfrm>
+                    <a:prstGeom prst="rect">
+                      <a:avLst/>
+                    </a:prstGeom>
+                  </pic:spPr>
+                </pic:pic>
+              </a:graphicData>
+            </a:graphic>
+          </wp:inline>
+        </w:drawing>
+      </w:r>
+      <w:r>
+        <w:drawing>
+          <wp:inline distT="0" distB="0" distL="0" distR="0" wp14:anchorId="7CCE6228" wp14:editId="5E380912">
+            <wp:extent cx="5731510" cy="2663825"/>
+            <wp:effectExtent l="0" t="0" r="2540" b="3175"/>
+            <wp:docPr id="1958211538" name="Picture 1"/>
+            <wp:cNvGraphicFramePr>
+              <a:graphicFrameLocks xmlns:a="http://schemas.openxmlformats.org/drawingml/2006/main" noChangeAspect="1"/>
+            </wp:cNvGraphicFramePr>
+            <a:graphic xmlns:a="http://schemas.openxmlformats.org/drawingml/2006/main">
+              <a:graphicData uri="http://schemas.openxmlformats.org/drawingml/2006/picture">
+                <pic:pic xmlns:pic="http://schemas.openxmlformats.org/drawingml/2006/picture">
+                  <pic:nvPicPr>
+                    <pic:cNvPr id="1958211538" name=""/>
+                    <pic:cNvPicPr/>
+                  </pic:nvPicPr>
+                  <pic:blipFill>
+                    <a:blip r:embed="rId8"/>
+                    <a:stretch>
+                      <a:fillRect/>
+                    </a:stretch>
+                  </pic:blipFill>
+                  <pic:spPr>
+                    <a:xfrm>
+                      <a:off x="0" y="0"/>
+                      <a:ext cx="5731510" cy="2663825"/>
+                    </a:xfrm>
+                    <a:prstGeom prst="rect">
+                      <a:avLst/>
+                    </a:prstGeom>
+                  </pic:spPr>
+                </pic:pic>
+              </a:graphicData>
+            </a:graphic>
+          </wp:inline>
+        </w:drawing>
+      </w:r>
+    </w:p>
     <w:sectPr>
       <w:pgSz w:w="11906" w:h="16838"/>
       <w:pgMar w:top="1440" w:right="1440" w:bottom="1440" w:left="1440" w:header="708" w:footer="708" w:gutter="0"/>
@@ -1189,6 +1332,7 @@
   <w:style w:type="character" w:default="1" w:styleId="DefaultParagraphFont">
     <w:name w:val="Default Paragraph Font"/>
     <w:uiPriority w:val="1"/>
+    <w:semiHidden/>
     <w:unhideWhenUsed/>
   </w:style>
   <w:style w:type="table" w:default="1" w:styleId="TableNormal">

</xml_diff>